<commit_message>
fix: add missing in-text citations for 6 references in BOER manuscript
Harvard style requires all reference list entries to be cited in body text.
Added formal citations for:
- Dunning and Kruger (1999) — Introduction
- Blanchard and Katz (1997) — Economics results (Phillips Curve)
- Piketty and Saez (2003) — Economics results (Kuznets Curve)
- Yerkes and Dodson (1908) — Psychology results
- Ebbinghaus (1885) — Psychology results
- Easterlin (1974) — Psychology results (Happiness U-Curve)

Co-Authored-By: Tatsuki Onishi <bougtoir@gmail.com>
</commit_message>
<xml_diff>
--- a/canonical_curves_reexamination/manuscript_canonical_curves_boer.docx
+++ b/canonical_curves_reexamination/manuscript_canonical_curves_boer.docx
@@ -145,7 +145,7 @@
         <w:rPr>
           <w:sz w:val="24"/>
         </w:rPr>
-        <w:t>The present study was motivated by a preliminary analysis of the Preston Curve conducted by the author, which revealed that the apparent concavity depends heavily on the position of the United States as a single influential observation—removing the US raised the p-value for the quadratic term to 0.49, rendering the nonlinear term non-significant. This finding raised the question of whether similar fragilities lurk beneath other canonical curves. The Environmental Kuznets Curve for CO₂ emissions has been repeatedly challenged (Grossman and Krueger, 1991; Stern, 2004), and the Dunning-Kruger effect has been argued to be a statistical artefact of regression to the mean (Krueger and Mueller, 2002).</w:t>
+        <w:t>The present study was motivated by a preliminary analysis of the Preston Curve conducted by the author, which revealed that the apparent concavity depends heavily on the position of the United States as a single influential observation—removing the US raised the p-value for the quadratic term to 0.49, rendering the nonlinear term non-significant. This finding raised the question of whether similar fragilities lurk beneath other canonical curves. The Environmental Kuznets Curve for CO₂ emissions has been repeatedly challenged (Grossman and Krueger, 1991; Stern, 2004), and the Dunning-Kruger effect (Dunning and Kruger, 1999) has been argued to be a statistical artefact of regression to the mean (Krueger and Mueller, 2002).</w:t>
       </w:r>
     </w:p>
     <w:p>
@@ -503,7 +503,7 @@
         <w:rPr>
           <w:sz w:val="24"/>
         </w:rPr>
-        <w:t>Of 12 curves, 6 were non-significant, 5 were outlier-dependent, and 1 demonstrated robust nonlinearity. The Phillips Curve (Phillips, 1958) showed no significant quadratic term (p = 0.905). The Kuznets Curve's inverted-U (Kuznets, 1955) was not significant with 130 countries (p = 0.108). The Environmental Kuznets Curve (CO₂), Laffer Curve, and Great Gatsby Curve were all outlier-dependent.</w:t>
+        <w:t>Of 12 curves, 6 were non-significant, 5 were outlier-dependent, and 1 demonstrated robust nonlinearity. The Phillips Curve (Phillips, 1958; Blanchard and Katz, 1997) showed no significant quadratic term (p = 0.905). The Kuznets Curve's inverted-U (Kuznets, 1955; Piketty and Saez, 2003) was not significant with 130 countries (p = 0.108). The Environmental Kuznets Curve (CO₂), Laffer Curve, and Great Gatsby Curve were all outlier-dependent.</w:t>
       </w:r>
     </w:p>
     <w:p>
@@ -575,7 +575,7 @@
         <w:rPr>
           <w:sz w:val="24"/>
         </w:rPr>
-        <w:t>Psychology showed high robustness: 4/5 curves were robust (Yerkes-Dodson, Ebbinghaus, Dunning-Kruger, Happiness U-Curve). Only the Weber-Fechner Law was non-significant.</w:t>
+        <w:t>Psychology showed high robustness: 4/5 curves were robust (Yerkes-Dodson (Yerkes and Dodson, 1908), Ebbinghaus forgetting curve (Ebbinghaus, 1885), Dunning-Kruger (Dunning and Kruger, 1999), and the Happiness U-Curve (Easterlin, 1974)). Only the Weber-Fechner Law was non-significant.</w:t>
       </w:r>
     </w:p>
     <w:p>

</xml_diff>